<commit_message>
Remove the acknowledgements from the handbook
Co-Authored-By: Claude Opus 5.5 <noreply@anthropic.com>
Claude-Session: https://claude.ai/code/session_01VkNWz9zCVkDAANuF8jpQYy
</commit_message>
<xml_diff>
--- a/Handbook-Editorial-Report.docx
+++ b/Handbook-Editorial-Report.docx
@@ -5790,7 +5790,7 @@
                 <w:sz w:val="19"/>
                 <w:szCs w:val="19"/>
               </w:rPr>
-              <w:t xml:space="preserve">Title page, copyright page, contents, preface and acknowledgements, and “Start here”, which explains to a complete beginner what a translator does, the four steps of every translation and the journey through the book.</w:t>
+              <w:t xml:space="preserve">Title page, copyright page, contents, preface with the Contributors list, and “Start here”, which explains to a complete beginner what a translator does, the four steps of every translation and the journey through the book.</w:t>
             </w:r>
           </w:p>
         </w:tc>
@@ -10489,7 +10489,7 @@
                 <w:sz w:val="19"/>
                 <w:szCs w:val="19"/>
               </w:rPr>
-              <w:t xml:space="preserve">Front matter: copyright page, preface, acknowledgements and “Start here”</w:t>
+              <w:t xml:space="preserve">Front matter: copyright page, preface, Contributors list and “Start here”</w:t>
             </w:r>
           </w:p>
         </w:tc>

</xml_diff>